<commit_message>
chore: remove build info and credits from settings
</commit_message>
<xml_diff>
--- a/docs/像素街機_PixelArcade_規格書_v1.2.docx
+++ b/docs/像素街機_PixelArcade_規格書_v1.2.docx
@@ -447,7 +447,7 @@
                 <w:sz w:val="19"/>
                 <w:szCs w:val="19"/>
               </w:rPr>
-              <w:t xml:space="preserve">新增玩家個人檔案（像素頭像、名字、玩家面板）與遊戲中設定；手機版優化；修正記憶翻牌閃爍；設定面板顯示建置時間</w:t>
+              <w:t xml:space="preserve">新增玩家個人檔案（像素頭像、名字、玩家面板）與遊戲中設定；手機版優化；修正記憶翻牌閃爍</w:t>
             </w:r>
           </w:p>
         </w:tc>
@@ -4157,7 +4157,7 @@
                 <w:sz w:val="19"/>
                 <w:szCs w:val="19"/>
               </w:rPr>
-              <w:t xml:space="preserve">點擊右上角頭貼開啟；「遊戲設定」分頁包含音效開關、音量、CRT 效果開關、清除所有紀錄（需二次確認）、建置時間（v1.2 起取代原本的設定按鈕）</w:t>
+              <w:t xml:space="preserve">點擊右上角頭貼開啟；「遊戲設定」分頁包含音效開關、音量、CRT 效果開關、清除所有紀錄（需二次確認）（v1.2 起取代原本的設定按鈕）；畫面上不顯示建置時間、授權說明等技術資訊</w:t>
             </w:r>
           </w:p>
         </w:tc>
@@ -8147,7 +8147,7 @@
         <w:spacing w:after="60"/>
       </w:pPr>
       <w:r>
-        <w:t xml:space="preserve">遊戲頁頂部列新增齒輪按鈕，點擊後先自動暫停，再打開與玩家面板「遊戲設定」分頁相同的設定內容（音效、音量、CRT 效果、清除紀錄、建置時間）。</w:t>
+        <w:t xml:space="preserve">遊戲頁頂部列新增齒輪按鈕，點擊後先自動暫停，再打開與玩家面板「遊戲設定」分頁相同的設定內容（音效、音量、CRT 效果、清除紀錄）。</w:t>
       </w:r>
     </w:p>
     <w:p>
@@ -34470,7 +34470,7 @@
         <w:spacing w:after="60"/>
       </w:pPr>
       <w:r>
-        <w:t xml:space="preserve">字型僅使用 SIL OFL 授權的開源字型，並在設定面板與 README 標註字型名稱與授權。</w:t>
+        <w:t xml:space="preserve">字型僅使用 SIL OFL 授權的開源字型，並在 README 與本規格書標註字型名稱與授權；網站畫面上不顯示授權說明。</w:t>
       </w:r>
     </w:p>
     <w:p>
@@ -40847,7 +40847,7 @@
                 <w:sz w:val="19"/>
                 <w:szCs w:val="19"/>
               </w:rPr>
-              <w:t xml:space="preserve">手機實機測試與優化、修正記憶翻牌閃爍、新增玩家個人檔案與遊戲中設定、設定面板顯示建置時間，單元測試增加到 129 個</w:t>
+              <w:t xml:space="preserve">手機實機測試與優化、修正記憶翻牌閃爍、新增玩家個人檔案與遊戲中設定，單元測試增加到 129 個</w:t>
             </w:r>
           </w:p>
         </w:tc>
@@ -41742,7 +41742,7 @@
                 <w:sz w:val="19"/>
                 <w:szCs w:val="19"/>
               </w:rPr>
-              <w:t xml:space="preserve">設定面板顯示建置時間以確認版本；網址加上 ?v= 參數避開瀏覽器快取</w:t>
+              <w:t xml:space="preserve">到 GitHub Actions 確認部署完成；網址加上 ?v= 參數避開瀏覽器快取</w:t>
             </w:r>
           </w:p>
         </w:tc>
@@ -45199,7 +45199,7 @@
                 <w:sz w:val="19"/>
                 <w:szCs w:val="19"/>
               </w:rPr>
-              <w:t xml:space="preserve">移除；字型授權改列於設定面板與 README</w:t>
+              <w:t xml:space="preserve">移除；字型授權改列於 README 與規格書，網站畫面上不顯示</w:t>
             </w:r>
           </w:p>
         </w:tc>

</xml_diff>